<commit_message>
docs: readable requirements diagram in report v5 (4 Innoslate parts)
Replaces the three low-resolution parts (Figures 7-9) with four Innoslate
screenshots (Figures 7-10) and a description of each part. Later figures are
renumbered (spider diagrams 11-12, Intelligence 13). Drops the "draft, to
confirm" note from the team contribution intro, as the team approved it.

Co-Authored-By: Claude Sonnet 5.5 <noreply@anthropic.com>
</commit_message>
<xml_diff>
--- a/docs/ch4-ch5/EcoCommute_Team6_Ch4-Ch5_System_Requirements_Definition_v5.docx
+++ b/docs/ch4-ch5/EcoCommute_Team6_Ch4-Ch5_System_Requirements_Definition_v5.docx
@@ -91,7 +91,7 @@
           <w:b w:val="0"/>
           <w:i w:val="0"/>
         </w:rPr>
-        <w:t>The table lists who contributed which part. Roles come from the team charter in the repository README; the contribution entries are a draft for the team to confirm before submission.</w:t>
+        <w:t>The table lists who contributed which part. Roles come from the team charter in the repository README.</w:t>
       </w:r>
     </w:p>
     <w:tbl>
@@ -15337,7 +15337,7 @@
           <w:b w:val="0"/>
           <w:i w:val="0"/>
         </w:rPr>
-        <w:t>Figures 7 to 9 show the same requirements diagram as exported from Innoslate, split into three parts so that it can be read: Part 1 is the left third, Part 2 the middle third and Part 3 the right third, with a small overlap between parts. The root '3 System Requirements' is at the top. Part 1 holds the Stakeholder Requirements and Input/Output Requirements groups; Part 2 holds the External Interface Requirements, each shown with the conduit, the external asset and the function that satisfy it; Part 3 holds the Functional and System-wide Requirements groups with their leaf requirements, including the top-level functional requirement 3.3.1 and the satisfying function F.2. Together they show that every system requirement is part of the hierarchy and is satisfied by a model element.</w:t>
+        <w:t>Figures 7 to 10 show the requirements diagram exported from Innoslate (SysML requirement diagram, stereotype 'Requirement'), captured in four overlapping parts so that the text is readable. Solid lines with a circled plus are decomposes relationships, dashed lines marked trace connect stakeholder requirements to system requirements, and dashed lines marked satisfy connect a system requirement to the model element that satisfies it. Part 1 (Figure 7) shows the Stakeholder Requirements root, the Input/Output Requirements group with its Input and Output groups, and the first external interface requirements 3.2.1 and 3.2.2, satisfied by the conduits Trip details and Result and advice, the asset Commuter and the functions F.1 and F.2. Part 2 (Figure 8) shows the root '3 System Requirements', the External Interface Requirements group and interface requirements 3.2.3 to 3.2.6 with their conduits (Weather query, Forecast, Reviewed factors, Summary request), external assets (Open-Meteo, Factor Publisher, Pilot Administrator) and the functions that satisfy them. Part 3 (Figure 9) shows interface requirements 3.2.7 and 3.2.8, the Hosting service conduit, Hosting Provider and F.6, and the stakeholder requirement groups 2.1 to 2.4 with the individual stakeholder requirements, each traced to system requirements. Part 4 (Figure 10) shows the Functional Requirements group, the top-level functional requirement 3.3.1 provide commute impact decision support, the System-wide Requirements group 3.4 with its six subgroups (Cost and Schedule, Performance, Availability and Capacity, Usability and Accessibility, Privacy and Security, Estimation Quality), and the Assurance Reviewer requirements 2.5.1 and 2.5.2 with their traces. Together they show that every system requirement belongs to the hierarchy, is traced from stakeholder requirements and is satisfied by a model element.</w:t>
       </w:r>
     </w:p>
     <w:p>
@@ -15349,7 +15349,7 @@
       <w:r>
         <w:drawing>
           <wp:inline xmlns:a="http://schemas.openxmlformats.org/drawingml/2006/main" xmlns:pic="http://schemas.openxmlformats.org/drawingml/2006/picture">
-            <wp:extent cx="8503920" cy="3212592"/>
+            <wp:extent cx="8503920" cy="6675311"/>
             <wp:docPr id="7" name="Picture 7"/>
             <wp:cNvGraphicFramePr>
               <a:graphicFrameLocks noChangeAspect="1"/>
@@ -15370,7 +15370,7 @@
                   <pic:spPr>
                     <a:xfrm>
                       <a:off x="0" y="0"/>
-                      <a:ext cx="8503920" cy="3212592"/>
+                      <a:ext cx="8503920" cy="6675311"/>
                     </a:xfrm>
                     <a:prstGeom prst="rect"/>
                   </pic:spPr>
@@ -15397,7 +15397,7 @@
           <w:i/>
           <w:sz w:val="19"/>
         </w:rPr>
-        <w:t>Requirements diagram from Innoslate, Part 1 of 3.</w:t>
+        <w:t>Requirements diagram from Innoslate, Part 1 of 4.</w:t>
       </w:r>
     </w:p>
     <w:p>
@@ -15409,7 +15409,7 @@
       <w:r>
         <w:drawing>
           <wp:inline xmlns:a="http://schemas.openxmlformats.org/drawingml/2006/main" xmlns:pic="http://schemas.openxmlformats.org/drawingml/2006/picture">
-            <wp:extent cx="8503920" cy="3212592"/>
+            <wp:extent cx="8503920" cy="5066438"/>
             <wp:docPr id="8" name="Picture 8"/>
             <wp:cNvGraphicFramePr>
               <a:graphicFrameLocks noChangeAspect="1"/>
@@ -15430,7 +15430,7 @@
                   <pic:spPr>
                     <a:xfrm>
                       <a:off x="0" y="0"/>
-                      <a:ext cx="8503920" cy="3212592"/>
+                      <a:ext cx="8503920" cy="5066438"/>
                     </a:xfrm>
                     <a:prstGeom prst="rect"/>
                   </pic:spPr>
@@ -15457,7 +15457,7 @@
           <w:i/>
           <w:sz w:val="19"/>
         </w:rPr>
-        <w:t>Requirements diagram from Innoslate, Part 2 of 3.</w:t>
+        <w:t>Requirements diagram from Innoslate, Part 2 of 4.</w:t>
       </w:r>
     </w:p>
     <w:p>
@@ -15469,7 +15469,7 @@
       <w:r>
         <w:drawing>
           <wp:inline xmlns:a="http://schemas.openxmlformats.org/drawingml/2006/main" xmlns:pic="http://schemas.openxmlformats.org/drawingml/2006/picture">
-            <wp:extent cx="8503920" cy="3212592"/>
+            <wp:extent cx="8503920" cy="4234952"/>
             <wp:docPr id="9" name="Picture 9"/>
             <wp:cNvGraphicFramePr>
               <a:graphicFrameLocks noChangeAspect="1"/>
@@ -15490,7 +15490,7 @@
                   <pic:spPr>
                     <a:xfrm>
                       <a:off x="0" y="0"/>
-                      <a:ext cx="8503920" cy="3212592"/>
+                      <a:ext cx="8503920" cy="4234952"/>
                     </a:xfrm>
                     <a:prstGeom prst="rect"/>
                   </pic:spPr>
@@ -15517,7 +15517,67 @@
           <w:i/>
           <w:sz w:val="19"/>
         </w:rPr>
-        <w:t>Requirements diagram from Innoslate, Part 3 of 3.</w:t>
+        <w:t>Requirements diagram from Innoslate, Part 3 of 4.</w:t>
+      </w:r>
+    </w:p>
+    <w:p>
+      <w:pPr>
+        <w:keepNext/>
+        <w:spacing w:after="40"/>
+        <w:jc w:val="center"/>
+      </w:pPr>
+      <w:r>
+        <w:drawing>
+          <wp:inline xmlns:a="http://schemas.openxmlformats.org/drawingml/2006/main" xmlns:pic="http://schemas.openxmlformats.org/drawingml/2006/picture">
+            <wp:extent cx="8503920" cy="4890343"/>
+            <wp:docPr id="10" name="Picture 10"/>
+            <wp:cNvGraphicFramePr>
+              <a:graphicFrameLocks noChangeAspect="1"/>
+            </wp:cNvGraphicFramePr>
+            <a:graphic>
+              <a:graphicData uri="http://schemas.openxmlformats.org/drawingml/2006/picture">
+                <pic:pic>
+                  <pic:nvPicPr>
+                    <pic:cNvPr id="0" name="innoslate_req_diagram_part4.png"/>
+                    <pic:cNvPicPr/>
+                  </pic:nvPicPr>
+                  <pic:blipFill>
+                    <a:blip r:embed="rId18"/>
+                    <a:stretch>
+                      <a:fillRect/>
+                    </a:stretch>
+                  </pic:blipFill>
+                  <pic:spPr>
+                    <a:xfrm>
+                      <a:off x="0" y="0"/>
+                      <a:ext cx="8503920" cy="4890343"/>
+                    </a:xfrm>
+                    <a:prstGeom prst="rect"/>
+                  </pic:spPr>
+                </pic:pic>
+              </a:graphicData>
+            </a:graphic>
+          </wp:inline>
+        </w:drawing>
+      </w:r>
+    </w:p>
+    <w:p>
+      <w:pPr>
+        <w:spacing w:after="160"/>
+      </w:pPr>
+      <w:r>
+        <w:rPr>
+          <w:b/>
+          <w:sz w:val="19"/>
+        </w:rPr>
+        <w:t xml:space="preserve">Figure 10. </w:t>
+      </w:r>
+      <w:r>
+        <w:rPr>
+          <w:i/>
+          <w:sz w:val="19"/>
+        </w:rPr>
+        <w:t>Requirements diagram from Innoslate, Part 4 of 4.</w:t>
       </w:r>
     </w:p>
     <w:p>
@@ -15537,7 +15597,7 @@
           <w:b w:val="0"/>
           <w:i w:val="0"/>
         </w:rPr>
-        <w:t>The spider diagram in Figure 10 is centered on the top-level functional requirement 3.3.1. It shows that 3.3.1 is satisfied by the top-level function F.2, decomposes into the eight leaf-level functional requirements, sits in group 3.3, and is traced from six stakeholder requirements spanning the commuter, sponsor, method and assurance stakeholders. The diagram in Figure 11 is centered on F.2 and relates form to function to requirement: the mechanism C.0 performs F.2, F.2 decomposes the Metafunction and is decomposed by F.2.0 to F.2.7, and F.2 satisfies 31 system requirements (a sample is shown).</w:t>
+        <w:t>The spider diagram in Figure 11 is centered on the top-level functional requirement 3.3.1. It shows that 3.3.1 is satisfied by the top-level function F.2, decomposes into the eight leaf-level functional requirements, sits in group 3.3, and is traced from six stakeholder requirements spanning the commuter, sponsor, method and assurance stakeholders. The diagram in Figure 12 is centered on F.2 and relates form to function to requirement: the mechanism C.0 performs F.2, F.2 decomposes the Metafunction and is decomposed by F.2.0 to F.2.7, and F.2 satisfies 31 system requirements (a sample is shown).</w:t>
       </w:r>
     </w:p>
     <w:p>
@@ -15550,7 +15610,7 @@
         <w:drawing>
           <wp:inline xmlns:a="http://schemas.openxmlformats.org/drawingml/2006/main" xmlns:pic="http://schemas.openxmlformats.org/drawingml/2006/picture">
             <wp:extent cx="5760720" cy="4674369"/>
-            <wp:docPr id="10" name="Picture 10"/>
+            <wp:docPr id="11" name="Picture 11"/>
             <wp:cNvGraphicFramePr>
               <a:graphicFrameLocks noChangeAspect="1"/>
             </wp:cNvGraphicFramePr>
@@ -15562,7 +15622,7 @@
                     <pic:cNvPicPr/>
                   </pic:nvPicPr>
                   <pic:blipFill>
-                    <a:blip r:embed="rId18"/>
+                    <a:blip r:embed="rId19"/>
                     <a:stretch>
                       <a:fillRect/>
                     </a:stretch>
@@ -15590,7 +15650,7 @@
           <w:b/>
           <w:sz w:val="19"/>
         </w:rPr>
-        <w:t xml:space="preserve">Figure 10. </w:t>
+        <w:t xml:space="preserve">Figure 11. </w:t>
       </w:r>
       <w:r>
         <w:rPr>
@@ -15610,7 +15670,7 @@
         <w:drawing>
           <wp:inline xmlns:a="http://schemas.openxmlformats.org/drawingml/2006/main" xmlns:pic="http://schemas.openxmlformats.org/drawingml/2006/picture">
             <wp:extent cx="5760720" cy="5194534"/>
-            <wp:docPr id="11" name="Picture 11"/>
+            <wp:docPr id="12" name="Picture 12"/>
             <wp:cNvGraphicFramePr>
               <a:graphicFrameLocks noChangeAspect="1"/>
             </wp:cNvGraphicFramePr>
@@ -15622,7 +15682,7 @@
                     <pic:cNvPicPr/>
                   </pic:nvPicPr>
                   <pic:blipFill>
-                    <a:blip r:embed="rId19"/>
+                    <a:blip r:embed="rId20"/>
                     <a:stretch>
                       <a:fillRect/>
                     </a:stretch>
@@ -15650,7 +15710,7 @@
           <w:b/>
           <w:sz w:val="19"/>
         </w:rPr>
-        <w:t xml:space="preserve">Figure 11. </w:t>
+        <w:t xml:space="preserve">Figure 12. </w:t>
       </w:r>
       <w:r>
         <w:rPr>
@@ -17611,7 +17671,7 @@
               <w:rPr>
                 <w:sz w:val="17"/>
               </w:rPr>
-              <w:t>Met. Figures 5 to 11.</w:t>
+              <w:t>Met. Figures 5 to 12.</w:t>
             </w:r>
           </w:p>
         </w:tc>
@@ -17728,7 +17788,7 @@
               <w:rPr>
                 <w:sz w:val="17"/>
               </w:rPr>
-              <w:t>Run on the imported model: overall pass rate 81%, no errors, warnings only (Figure 12). Remaining warnings are expected at this stage, for example first-level functions not yet allocated to mechanisms, which the lab defers.</w:t>
+              <w:t>Run on the imported model: overall pass rate 81%, no errors, warnings only (Figure 13). Remaining warnings are expected at this stage, for example first-level functions not yet allocated to mechanisms, which the lab defers.</w:t>
             </w:r>
           </w:p>
         </w:tc>
@@ -17749,7 +17809,7 @@
         <w:drawing>
           <wp:inline xmlns:a="http://schemas.openxmlformats.org/drawingml/2006/main" xmlns:pic="http://schemas.openxmlformats.org/drawingml/2006/picture">
             <wp:extent cx="5852160" cy="3198205"/>
-            <wp:docPr id="12" name="Picture 12"/>
+            <wp:docPr id="13" name="Picture 13"/>
             <wp:cNvGraphicFramePr>
               <a:graphicFrameLocks noChangeAspect="1"/>
             </wp:cNvGraphicFramePr>
@@ -17761,7 +17821,7 @@
                     <pic:cNvPicPr/>
                   </pic:nvPicPr>
                   <pic:blipFill>
-                    <a:blip r:embed="rId20"/>
+                    <a:blip r:embed="rId21"/>
                     <a:stretch>
                       <a:fillRect/>
                     </a:stretch>
@@ -17789,7 +17849,7 @@
           <w:b/>
           <w:sz w:val="19"/>
         </w:rPr>
-        <w:t xml:space="preserve">Figure 12. </w:t>
+        <w:t xml:space="preserve">Figure 13. </w:t>
       </w:r>
       <w:r>
         <w:rPr>

</xml_diff>